<commit_message>
Organize reference data assets
</commit_message>
<xml_diff>
--- a/docs/WCC4SM_INPUT_OUTPUT_DATA_FORMATS_V1.docx
+++ b/docs/WCC4SM_INPUT_OUTPUT_DATA_FORMATS_V1.docx
@@ -749,6 +749,41 @@
           <w:rFonts w:ascii="Microsoft YaHei" w:hAnsi="Microsoft YaHei"/>
         </w:rPr>
         <w:t>5. 参考线选择模式 CSV</w:t>
+      </w:r>
+    </w:p>
+    <w:p>
+      <w:r>
+        <w:t/>
+      </w:r>
+    </w:p>
+    <w:p>
+      <w:r>
+        <w:rPr>
+          <w:rFonts w:ascii="Microsoft YaHei" w:hAnsi="Microsoft YaHei"/>
+          <w:sz w:val="21"/>
+          <w:szCs w:val="21"/>
+        </w:rPr>
+        <w:t>随软件发布的参考主库、选择模式和对应元数据位于 reference_data/，示例参考库</w:t>
+      </w:r>
+    </w:p>
+    <w:p>
+      <w:r>
+        <w:rPr>
+          <w:rFonts w:ascii="Microsoft YaHei" w:hAnsi="Microsoft YaHei"/>
+          <w:sz w:val="21"/>
+          <w:szCs w:val="21"/>
+        </w:rPr>
+        <w:t>位于 reference_data/examples/。选择模式中的 MasterSource 使用主库文件名，</w:t>
+      </w:r>
+    </w:p>
+    <w:p>
+      <w:r>
+        <w:rPr>
+          <w:rFonts w:ascii="Microsoft YaHei" w:hAnsi="Microsoft YaHei"/>
+          <w:sz w:val="21"/>
+          <w:szCs w:val="21"/>
+        </w:rPr>
+        <w:t>不保存机器相关的绝对路径。</w:t>
       </w:r>
     </w:p>
     <w:p>

</xml_diff>

<commit_message>
Add licensing help and EXE deployment
</commit_message>
<xml_diff>
--- a/docs/WCC4SM_INPUT_OUTPUT_DATA_FORMATS_V1.docx
+++ b/docs/WCC4SM_INPUT_OUTPUT_DATA_FORMATS_V1.docx
@@ -1946,6 +1946,58 @@
           <w:szCs w:val="21"/>
         </w:rPr>
         <w:t>• 结构不一致、无效系数和不支持的主版本必须报错。</w:t>
+      </w:r>
+    </w:p>
+    <w:p>
+      <w:r>
+        <w:t/>
+      </w:r>
+    </w:p>
+    <w:p>
+      <w:pPr>
+        <w:outlineLvl w:val="1"/>
+        <w:pStyle w:val="Heading2"/>
+      </w:pPr>
+      <w:r>
+        <w:rPr>
+          <w:rFonts w:ascii="Microsoft YaHei" w:hAnsi="Microsoft YaHei"/>
+        </w:rPr>
+        <w:t>12. PDF 帮助文档</w:t>
+      </w:r>
+    </w:p>
+    <w:p>
+      <w:r>
+        <w:t/>
+      </w:r>
+    </w:p>
+    <w:p>
+      <w:r>
+        <w:rPr>
+          <w:rFonts w:ascii="Microsoft YaHei" w:hAnsi="Microsoft YaHei"/>
+          <w:sz w:val="21"/>
+          <w:szCs w:val="21"/>
+        </w:rPr>
+        <w:t>帮助资料以 .pdf 文件形式存放在外部 docs/ 目录或其子目录。软件只建立文件</w:t>
+      </w:r>
+    </w:p>
+    <w:p>
+      <w:r>
+        <w:rPr>
+          <w:rFonts w:ascii="Microsoft YaHei" w:hAnsi="Microsoft YaHei"/>
+          <w:sz w:val="21"/>
+          <w:szCs w:val="21"/>
+        </w:rPr>
+        <w:t>列表并调用系统阅读器，不修改PDF内容。第三方论文和标准必须由发布者或用户确认</w:t>
+      </w:r>
+    </w:p>
+    <w:p>
+      <w:r>
+        <w:rPr>
+          <w:rFonts w:ascii="Microsoft YaHei" w:hAnsi="Microsoft YaHei"/>
+          <w:sz w:val="21"/>
+          <w:szCs w:val="21"/>
+        </w:rPr>
+        <w:t>具有合法的复制与使用权限；WCC4SM 的 Apache License 2.0 不覆盖这些第三方文件。</w:t>
       </w:r>
     </w:p>
     <w:p>

</xml_diff>

<commit_message>
Prepare V0.9 release candidate
</commit_message>
<xml_diff>
--- a/docs/WCC4SM_INPUT_OUTPUT_DATA_FORMATS_V1.docx
+++ b/docs/WCC4SM_INPUT_OUTPUT_DATA_FORMATS_V1.docx
@@ -41,7 +41,7 @@
           <w:sz w:val="21"/>
           <w:szCs w:val="21"/>
         </w:rPr>
-        <w:t>适用软件：WCC4SM V0.6.2</w:t>
+        <w:t>适用软件：WCC4SM V0.9</w:t>
       </w:r>
     </w:p>
     <w:p>
@@ -234,7 +234,7 @@
           <w:sz w:val="21"/>
           <w:szCs w:val="21"/>
         </w:rPr>
-        <w:t>单列被解释为强度。V0.6.2 为样本建立从 1 开始的像素序列。</w:t>
+        <w:t>单列被解释为强度。V0.9 为样本建立从 1 开始的像素序列。</w:t>
       </w:r>
     </w:p>
     <w:p>

</xml_diff>